<commit_message>
z1: save current state before adaptive PID and pH regulation work
</commit_message>
<xml_diff>
--- a/docs/Review_Deputy_Geology_Rus.docx
+++ b/docs/Review_Deputy_Geology_Rus.docx
@@ -4,24 +4,20 @@
   <w:body>
     <w:p>
       <w:pPr>
-        <w:pStyle w:val="Heading1"/>
-        <w:keepNext w:val="true"/>
-        <w:keepLines/>
-        <w:spacing w:before="480" w:after="0"/>
+        <w:pStyle w:val="Title"/>
         <w:rPr/>
       </w:pPr>
       <w:r>
         <w:rPr/>
-        <w:t>Рецензия заместителя руководителя Геологической службы Республики Таджикистан</w:t>
+        <w:t>Рецензия заместителя руководителя Геологи</w:t>
       </w:r>
-    </w:p>
-    <w:p>
-      <w:pPr>
-        <w:pStyle w:val="Normal"/>
-        <w:rPr/>
-      </w:pPr>
       <w:r>
         <w:rPr/>
+        <w:t>и</w:t>
+      </w:r>
+      <w:r>
+        <w:rPr/>
+        <w:t xml:space="preserve"> Республики Таджикистан</w:t>
       </w:r>
     </w:p>
     <w:p>
@@ -48,15 +44,6 @@
         <w:rPr/>
       </w:pPr>
       <w:r>
-        <w:rPr/>
-      </w:r>
-    </w:p>
-    <w:p>
-      <w:pPr>
-        <w:pStyle w:val="Normal"/>
-        <w:rPr/>
-      </w:pPr>
-      <w:r>
         <w:rPr>
           <w:b/>
         </w:rPr>
@@ -64,217 +51,309 @@
       </w:r>
       <w:r>
         <w:rPr/>
-        <w:t xml:space="preserve"> Высокая (отлично).</w:t>
+        <w:t xml:space="preserve"> Высокая (отлично), с условием выполнения дополнительных требований.</w:t>
       </w:r>
     </w:p>
     <w:p>
       <w:pPr>
-        <w:pStyle w:val="Normal"/>
+        <w:pStyle w:val="Heading1"/>
         <w:rPr/>
       </w:pPr>
       <w:r>
         <w:rPr/>
+        <w:t>Краткое содержание</w:t>
       </w:r>
     </w:p>
     <w:p>
       <w:pPr>
         <w:pStyle w:val="Normal"/>
+        <w:rPr/>
+      </w:pPr>
+      <w:r>
+        <w:rPr/>
+        <w:t>Система CAP демонстрирует полноценный контур автоматизации обогатительного участка: сбор телеметрии по протоколу Modbus TCP, историк данных, металлургический баланс, супервизорные ПИД</w:t>
+        <w:noBreakHyphen/>
+        <w:t>контуры, обработку тревог по ISA</w:t>
+        <w:noBreakHyphen/>
+        <w:t>18.2 и веб</w:t>
+        <w:noBreakHyphen/>
+        <w:t>интерфейс диспетчера. Особо отмечаются следующие аспекты:</w:t>
+      </w:r>
+    </w:p>
+    <w:p>
+      <w:pPr>
+        <w:pStyle w:val="ListNumber"/>
+        <w:numPr>
+          <w:ilvl w:val="0"/>
+          <w:numId w:val="4"/>
+        </w:numPr>
         <w:rPr/>
       </w:pPr>
       <w:r>
         <w:rPr>
           <w:b/>
         </w:rPr>
-        <w:t>Краткое содержание:</w:t>
+        <w:t>Надёжность телеметрии.</w:t>
       </w:r>
       <w:r>
         <w:rPr/>
-        <w:t xml:space="preserve">  </w:t>
+        <w:t xml:space="preserve"> Идемпотентный ingest с message_id и store</w:t>
+        <w:noBreakHyphen/>
+        <w:t>and</w:t>
+        <w:noBreakHyphen/>
+        <w:t>forward буфером исключает потери данных и дублирование при обрывах связи, что критично для обогатительных комплексов, работающих в удалённых горных районах с нестабильной коммуникационной инфраструктурой.</w:t>
       </w:r>
     </w:p>
     <w:p>
       <w:pPr>
-        <w:pStyle w:val="Normal"/>
+        <w:pStyle w:val="ListNumber"/>
+        <w:numPr>
+          <w:ilvl w:val="0"/>
+          <w:numId w:val="4"/>
+        </w:numPr>
         <w:rPr/>
       </w:pPr>
-      <w:r>
-        <w:rPr/>
-        <w:t>Система CAP демонстрирует полноценный контур автоматизации: сбор телеметрии по реальному протоколу Modbus TCP, историк, металлургический баланс, три супервизорных ПИД</w:t>
-        <w:noBreakHyphen/>
-        <w:t>контура, обработку тревог по ISA</w:t>
-        <w:noBreakHyphen/>
-        <w:t>18.2 и веб</w:t>
-        <w:noBreakHyphen/>
-        <w:t>интерфейс на русском языке. Особенно отмечаются следующие аспекты:</w:t>
-      </w:r>
-    </w:p>
-    <w:p>
-      <w:pPr>
-        <w:pStyle w:val="Normal"/>
-        <w:rPr/>
-      </w:pPr>
-      <w:r>
-        <w:rPr/>
-      </w:r>
-    </w:p>
-    <w:p>
-      <w:pPr>
-        <w:pStyle w:val="Normal"/>
-        <w:rPr/>
-      </w:pPr>
-      <w:r>
-        <w:rPr/>
-        <w:t xml:space="preserve">1. </w:t>
-      </w:r>
-      <w:r>
-        <w:rPr>
-          <w:b/>
-        </w:rPr>
-        <w:t>Надёжность телеметрии</w:t>
-      </w:r>
-      <w:r>
-        <w:rPr/>
-        <w:t xml:space="preserve"> – использование идемпотентного ingest с message_id и store</w:t>
-        <w:noBreakHyphen/>
-        <w:t>and</w:t>
-        <w:noBreakHyphen/>
-        <w:t>forward буфером исключает потери данных и дублирование при обрывах связи, что критично для геологоразведочных и обогатительных комплексов, работающих в удалённых горных районах.</w:t>
-      </w:r>
-    </w:p>
-    <w:p>
-      <w:pPr>
-        <w:pStyle w:val="Normal"/>
-        <w:rPr/>
-      </w:pPr>
-      <w:r>
-        <w:rPr/>
-        <w:t xml:space="preserve">2. </w:t>
-      </w:r>
       <w:r>
         <w:rPr>
           <w:b/>
         </w:rPr>
         <w:t>Гибкость размещения ПИД</w:t>
         <w:noBreakHyphen/>
-        <w:t>алгоритмов</w:t>
+        <w:t>алгоритмов.</w:t>
       </w:r>
       <w:r>
         <w:rPr/>
-        <w:t xml:space="preserve"> – возможность выполнения регулирующих контуров на центральном сервере, внешних ПЛК или микроконтроллерах ESP32 через Modbus FC6 позволяет адаптировать систему под конкретные условия объекта и уменьшать задержки управления.</w:t>
+        <w:t xml:space="preserve"> Возможность выполнения регулирующих контуров на центральном сервере, внешних ПЛК или микроконтроллерах ESP32 через Modbus FC6 позволяет адаптировать систему под конкретные условия действующего объекта без остановки производства.</w:t>
       </w:r>
     </w:p>
     <w:p>
       <w:pPr>
-        <w:pStyle w:val="Normal"/>
+        <w:pStyle w:val="ListNumber"/>
+        <w:numPr>
+          <w:ilvl w:val="0"/>
+          <w:numId w:val="4"/>
+        </w:numPr>
         <w:rPr/>
       </w:pPr>
-      <w:r>
-        <w:rPr/>
-        <w:t xml:space="preserve">3. </w:t>
-      </w:r>
       <w:r>
         <w:rPr>
           <w:b/>
         </w:rPr>
-        <w:t>Металлургический баланс с аудируемыми формулами</w:t>
+        <w:t>Аудируемый металлургический баланс.</w:t>
       </w:r>
       <w:r>
         <w:rPr/>
-        <w:t xml:space="preserve"> – каждый показатель сопровождается строкой формулы и тегами</w:t>
+        <w:t xml:space="preserve"> Каждый показатель сопровождается строкой формулы и тегами</w:t>
         <w:noBreakHyphen/>
-        <w:t>источниками, что обеспечивает прозрачность расчётов и упрощает верификацию результатов в соответствии с требованиями горно</w:t>
+        <w:t>источниками, что обеспечивает прозрачность расчётов и упрощает верификацию результатов при горно</w:t>
         <w:noBreakHyphen/>
-        <w:t>геологической экспертизы.</w:t>
+        <w:t>геологической экспертизе и подсчёте потерь полезных компонентов.</w:t>
       </w:r>
     </w:p>
     <w:p>
       <w:pPr>
-        <w:pStyle w:val="Normal"/>
+        <w:pStyle w:val="ListNumber"/>
+        <w:numPr>
+          <w:ilvl w:val="0"/>
+          <w:numId w:val="4"/>
+        </w:numPr>
         <w:rPr/>
       </w:pPr>
-      <w:r>
-        <w:rPr/>
-        <w:t xml:space="preserve">4. </w:t>
-      </w:r>
       <w:r>
         <w:rPr>
           <w:b/>
         </w:rPr>
         <w:t>Тревоги по ISA</w:t>
         <w:noBreakHyphen/>
-        <w:t>18.2</w:t>
+        <w:t>18.2.</w:t>
       </w:r>
       <w:r>
         <w:rPr/>
-        <w:t xml:space="preserve"> – рационализированные уставки, задержки и гистерезис снижают ложные срабатывания, а неизменяемый журнал с квитированием оператора соответствует международным стандартам безопасности на горных предприятиях.</w:t>
+        <w:t xml:space="preserve"> Рационализированные уставки, задержки и гистерезис снижают поток ложных срабатываний, а неизменяемый журнал с квитированием оператора соответствует международной практике промышленной безопасности.</w:t>
       </w:r>
     </w:p>
     <w:p>
       <w:pPr>
-        <w:pStyle w:val="Normal"/>
+        <w:pStyle w:val="ListNumber"/>
+        <w:numPr>
+          <w:ilvl w:val="0"/>
+          <w:numId w:val="4"/>
+        </w:numPr>
         <w:rPr/>
       </w:pPr>
-      <w:r>
-        <w:rPr/>
-        <w:t xml:space="preserve">5. </w:t>
-      </w:r>
       <w:r>
         <w:rPr>
           <w:b/>
         </w:rPr>
-        <w:t>Безопасность и аудит</w:t>
+        <w:t>Защита информации.</w:t>
       </w:r>
       <w:r>
         <w:rPr/>
-        <w:t xml:space="preserve"> – PBKDF2</w:t>
+        <w:t xml:space="preserve"> PBKDF2</w:t>
         <w:noBreakHyphen/>
-        <w:t>хэши паролей, HttpOnly</w:t>
+        <w:t>хэширование паролей, HttpOnly</w:t>
         <w:noBreakHyphen/>
-        <w:t>сессии, RBAC, машинная аутентификация шлюзов и криптографически защищённый аудит отвечают современным требованиям защиты информации в промышленной автоматике.</w:t>
+        <w:t>сессии, ролевая модель доступа (RBAC), машинная аутентификация шлюзов и криптографически защищённый аудит отвечают современным требованиям к защите информации в промышленной автоматике.</w:t>
       </w:r>
     </w:p>
     <w:p>
       <w:pPr>
-        <w:pStyle w:val="Normal"/>
+        <w:pStyle w:val="Heading1"/>
         <w:rPr/>
       </w:pPr>
       <w:r>
         <w:rPr/>
+        <w:t>Замечания и обязательные требования к пилотному внедрению</w:t>
       </w:r>
     </w:p>
     <w:p>
       <w:pPr>
         <w:pStyle w:val="Normal"/>
+        <w:rPr/>
+      </w:pPr>
+      <w:r>
+        <w:rPr/>
+        <w:t>Для допуска системы к пилотному внедрению на действующей обогатительной фабрике при пилотном внедрении необходимо выполнить следующее:</w:t>
+      </w:r>
+    </w:p>
+    <w:p>
+      <w:pPr>
+        <w:pStyle w:val="ListNumber"/>
+        <w:numPr>
+          <w:ilvl w:val="0"/>
+          <w:numId w:val="4"/>
+        </w:numPr>
         <w:rPr/>
       </w:pPr>
       <w:r>
         <w:rPr>
           <w:b/>
         </w:rPr>
-        <w:t>Вывод:</w:t>
+        <w:t>Испытания на реальном объекте:</w:t>
       </w:r>
       <w:r>
         <w:rPr/>
-        <w:t xml:space="preserve">  </w:t>
+        <w:t xml:space="preserve"> не менее 30 суток непрерывной работы в режиме «только наблюдение» (без управляющего воздействия) с сопоставлением телеметрии CAP с показаниями штатных КИП фабрики.</w:t>
       </w:r>
     </w:p>
     <w:p>
       <w:pPr>
-        <w:pStyle w:val="Normal"/>
+        <w:pStyle w:val="ListNumber"/>
+        <w:numPr>
+          <w:ilvl w:val="0"/>
+          <w:numId w:val="4"/>
+        </w:numPr>
         <w:rPr/>
       </w:pPr>
+      <w:r>
+        <w:rPr>
+          <w:b/>
+        </w:rPr>
+        <w:t>Резервирование критических узлов:</w:t>
+      </w:r>
       <w:r>
         <w:rPr/>
-        <w:t>CAP представляет собой современное, технологически зрелое решение, которое может быть успешно применено на объектах обогащения руд в Республике Таджикистан. Система обеспечивает повышение эффективности переработки, снижение потерь полезных компонентов и улучшение показателей безопасности труда. Рекомендуется к внедрению в пилотном режиме на одном из действующих обогатительных фабрик с последующим масштабированием на другие предприятия отрасли.</w:t>
+        <w:t xml:space="preserve"> отказ сервера или канала связи не должен приводить к потере управления контурами регулирования — требуется подтверждённый fallback на локальные ПЛК/ESP32.</w:t>
       </w:r>
     </w:p>
     <w:p>
       <w:pPr>
+        <w:pStyle w:val="ListNumber"/>
+        <w:numPr>
+          <w:ilvl w:val="0"/>
+          <w:numId w:val="4"/>
+        </w:numPr>
+        <w:rPr/>
+      </w:pPr>
+      <w:r>
+        <w:rPr>
+          <w:b/>
+        </w:rPr>
+        <w:t>Калибровка и поверка входных сигналов:</w:t>
+      </w:r>
+      <w:r>
+        <w:rPr/>
+        <w:t xml:space="preserve"> привязка всех тегов к поверенным датчикам с регистрацией пределов погрешности в паспорте системы.</w:t>
+      </w:r>
+    </w:p>
+    <w:p>
+      <w:pPr>
+        <w:pStyle w:val="ListNumber"/>
+        <w:numPr>
+          <w:ilvl w:val="0"/>
+          <w:numId w:val="4"/>
+        </w:numPr>
+        <w:rPr/>
+      </w:pPr>
+      <w:r>
+        <w:rPr>
+          <w:b/>
+        </w:rPr>
+        <w:t>Подготовка эксплуатационной документации:</w:t>
+      </w:r>
+      <w:r>
+        <w:rPr/>
+        <w:t xml:space="preserve"> руководство оператора, регламент действий при тревогах, инструкции по восстановлению после аварийных отключений — на русском и таджикском языках.</w:t>
+      </w:r>
+    </w:p>
+    <w:p>
+      <w:pPr>
+        <w:pStyle w:val="ListNumber"/>
+        <w:numPr>
+          <w:ilvl w:val="0"/>
+          <w:numId w:val="4"/>
+        </w:numPr>
+        <w:rPr/>
+      </w:pPr>
+      <w:r>
+        <w:rPr>
+          <w:b/>
+        </w:rPr>
+        <w:t>Обучение персонала:</w:t>
+      </w:r>
+      <w:r>
+        <w:rPr/>
+        <w:t xml:space="preserve"> программа обучения операторов и инженеров КИПиА (не менее 40 учебных часов) с проверкой знаний перед вводом в опытную эксплуатацию.</w:t>
+      </w:r>
+    </w:p>
+    <w:p>
+      <w:pPr>
+        <w:pStyle w:val="ListNumber"/>
+        <w:numPr>
+          <w:ilvl w:val="0"/>
+          <w:numId w:val="4"/>
+        </w:numPr>
+        <w:rPr/>
+      </w:pPr>
+      <w:r>
+        <w:rPr>
+          <w:b/>
+        </w:rPr>
+        <w:t>Согласование с действующими нормами:</w:t>
+      </w:r>
+      <w:r>
+        <w:rPr/>
+        <w:t xml:space="preserve"> проверка соответствия требованиям промышленной безопасности и, при необходимости, прохождение экспертизы в установленном порядке.</w:t>
+      </w:r>
+    </w:p>
+    <w:p>
+      <w:pPr>
+        <w:pStyle w:val="Heading1"/>
+        <w:rPr/>
+      </w:pPr>
+      <w:r>
+        <w:rPr/>
+        <w:t>Вывод</w:t>
+      </w:r>
+    </w:p>
+    <w:p>
+      <w:pPr>
         <w:pStyle w:val="Normal"/>
         <w:rPr/>
       </w:pPr>
       <w:r>
         <w:rPr/>
+        <w:t>CAP представляет собой современное, технологически зрелое решение, применимое на объектах обогащения руд в Республике Таджикистан. Система обеспечивает повышение эффективности переработки, снижение потерь полезных компонентов и улучшение безопасности труда. После выполнения перечисленных требований рекомендуется внедрение в пилотном режиме на одной из действующих обогатительных фабрик с последующим масштабированием на другие предприятия отрасли.</w:t>
       </w:r>
     </w:p>
     <w:p>
@@ -288,19 +367,15 @@
         </w:rPr>
         <w:t>Подпись:</w:t>
       </w:r>
+    </w:p>
+    <w:p>
+      <w:pPr>
+        <w:pStyle w:val="Normal"/>
+        <w:rPr/>
+      </w:pPr>
       <w:r>
         <w:rPr/>
-        <w:t xml:space="preserve">  </w:t>
-      </w:r>
-    </w:p>
-    <w:p>
-      <w:pPr>
-        <w:pStyle w:val="Normal"/>
-        <w:rPr/>
-      </w:pPr>
-      <w:r>
-        <w:rPr/>
-        <w:t>_Заместитель руководителяГеологи</w:t>
+        <w:t>Заместитель руководителя Геологи</w:t>
       </w:r>
       <w:r>
         <w:rPr/>
@@ -308,13 +383,12 @@
       </w:r>
       <w:r>
         <w:rPr/>
-        <w:t xml:space="preserve"> Республики Таджикистан_  </w:t>
+        <w:t xml:space="preserve">  Республики Таджикистан:</w:t>
       </w:r>
     </w:p>
     <w:p>
       <w:pPr>
         <w:pStyle w:val="Normal"/>
-        <w:jc w:val="end"/>
         <w:rPr/>
       </w:pPr>
       <w:r>
@@ -325,14 +399,15 @@
     <w:p>
       <w:pPr>
         <w:pStyle w:val="Normal"/>
-        <w:spacing w:before="0" w:after="200"/>
+        <w:widowControl/>
+        <w:bidi w:val="0"/>
+        <w:spacing w:lineRule="auto" w:line="276" w:before="0" w:after="200"/>
         <w:jc w:val="start"/>
         <w:rPr/>
       </w:pPr>
       <w:r>
         <w:rPr/>
-        <w:br/>
-        <w:t>_Дата: 11 сентября 2026 г.</w:t>
+        <w:t>Дата: 14 сентября 2026 г.</w:t>
       </w:r>
     </w:p>
     <w:sectPr>

</xml_diff>